<commit_message>
Add repository link to LAB2 report
</commit_message>
<xml_diff>
--- a/LAB2/LAB2_English_Report_IEEE_Template.docx
+++ b/LAB2/LAB2_English_Report_IEEE_Template.docx
@@ -36,7 +36,7 @@
     <w:p>
       <w:pPr>
         <w:pStyle w:val="Authors"/>
-        <w:spacing w:before="0" w:after="80" w:line="240" w:lineRule="auto"/>
+        <w:spacing w:before="0" w:after="20" w:line="240" w:lineRule="auto"/>
         <w:jc w:val="center"/>
       </w:pPr>
       <w:r>
@@ -48,6 +48,31 @@
         </w:rPr>
         <w:t>Student ID: 24020036039</w:t>
       </w:r>
+    </w:p>
+    <w:p>
+      <w:pPr>
+        <w:pStyle w:val="Authors"/>
+        <w:spacing w:before="0" w:after="80"/>
+        <w:jc w:val="center"/>
+      </w:pPr>
+      <w:r>
+        <w:rPr>
+          <w:rFonts w:ascii="Times New Roman" w:hAnsi="Times New Roman"/>
+          <w:color w:val="666666"/>
+          <w:sz w:val="17"/>
+        </w:rPr>
+        <w:t xml:space="preserve">Repository: </w:t>
+      </w:r>
+      <w:hyperlink r:id="rId8">
+        <w:r>
+          <w:rPr>
+            <w:color w:val="000000"/>
+            <w:u w:val="single"/>
+            <w:sz w:val="17"/>
+          </w:rPr>
+          <w:t>GitHub repository: lizh-coder/Robotics-Integration-Team-Project-I</w:t>
+        </w:r>
+      </w:hyperlink>
     </w:p>
     <w:p>
       <w:pPr>
@@ -1457,7 +1482,7 @@
                     <pic:cNvPicPr/>
                   </pic:nvPicPr>
                   <pic:blipFill>
-                    <a:blip r:embed="rId8"/>
+                    <a:blip r:embed="rId9"/>
                     <a:stretch>
                       <a:fillRect/>
                     </a:stretch>
@@ -2384,7 +2409,7 @@
                     <pic:cNvPicPr/>
                   </pic:nvPicPr>
                   <pic:blipFill>
-                    <a:blip r:embed="rId9"/>
+                    <a:blip r:embed="rId10"/>
                     <a:stretch>
                       <a:fillRect/>
                     </a:stretch>
@@ -2462,7 +2487,7 @@
                     <pic:cNvPicPr/>
                   </pic:nvPicPr>
                   <pic:blipFill>
-                    <a:blip r:embed="rId10"/>
+                    <a:blip r:embed="rId11"/>
                     <a:stretch>
                       <a:fillRect/>
                     </a:stretch>
@@ -2615,7 +2640,7 @@
                     <pic:cNvPicPr/>
                   </pic:nvPicPr>
                   <pic:blipFill>
-                    <a:blip r:embed="rId11"/>
+                    <a:blip r:embed="rId12"/>
                     <a:stretch>
                       <a:fillRect/>
                     </a:stretch>
@@ -2672,7 +2697,7 @@
                     <pic:cNvPicPr/>
                   </pic:nvPicPr>
                   <pic:blipFill>
-                    <a:blip r:embed="rId12"/>
+                    <a:blip r:embed="rId13"/>
                     <a:stretch>
                       <a:fillRect/>
                     </a:stretch>
@@ -2714,7 +2739,7 @@
                     <pic:cNvPicPr/>
                   </pic:nvPicPr>
                   <pic:blipFill>
-                    <a:blip r:embed="rId13"/>
+                    <a:blip r:embed="rId14"/>
                     <a:stretch>
                       <a:fillRect/>
                     </a:stretch>
@@ -3326,7 +3351,7 @@
                     <pic:cNvPicPr/>
                   </pic:nvPicPr>
                   <pic:blipFill>
-                    <a:blip r:embed="rId14"/>
+                    <a:blip r:embed="rId15"/>
                     <a:stretch>
                       <a:fillRect/>
                     </a:stretch>
@@ -3593,7 +3618,7 @@
                     <pic:cNvPicPr/>
                   </pic:nvPicPr>
                   <pic:blipFill>
-                    <a:blip r:embed="rId15"/>
+                    <a:blip r:embed="rId16"/>
                     <a:stretch>
                       <a:fillRect/>
                     </a:stretch>

</xml_diff>

<commit_message>
Remove operational instructions from LAB2 report
</commit_message>
<xml_diff>
--- a/LAB2/LAB2_English_Report_IEEE_Template.docx
+++ b/LAB2/LAB2_English_Report_IEEE_Template.docx
@@ -85,7 +85,7 @@
           <w:color w:val="000000"/>
           <w:sz w:val="17"/>
         </w:rPr>
-        <w:t>Abstract - This report documents the installation and use of ROS 1 Noetic for the MIT VNAV Lab 2 two-drone exercise. The work reuses the supplied two_drones_pkg skeleton, builds a catkin workspace under Ubuntu 20.04 on WSL2, publishes the world-to-drone transforms, queries relative transforms with tf2, and visualizes the trajectories in RViz. The dynamic implementation was verified at 50 Hz, and the required homogeneous-transform and quaternion derivations are included. Runtime screenshots remain marked as placeholders for insertion from the student's own terminal and RViz session.</w:t>
+        <w:t>Abstract - This report documents the installation and use of ROS 1 Noetic for the MIT VNAV Lab 2 two-drone exercise. The work reuses the supplied two_drones_pkg skeleton, builds a catkin workspace under Ubuntu 20.04 on WSL2, publishes the world-to-drone transforms, queries relative transforms with tf2, and visualizes the trajectories in RViz. The dynamic implementation was verified at 50 Hz, and the required homogeneous-transform and quaternion derivations are included. Runtime evidence is provided in the accompanying figures.</w:t>
       </w:r>
     </w:p>
     <w:p>
@@ -657,7 +657,7 @@
                 <w:color w:val="000000"/>
                 <w:sz w:val="16"/>
               </w:rPr>
-              <w:t>Screenshots</w:t>
+              <w:t>Runtime evidence</w:t>
             </w:r>
           </w:p>
         </w:tc>
@@ -691,7 +691,7 @@
                 <w:color w:val="000000"/>
                 <w:sz w:val="16"/>
               </w:rPr>
-              <w:t>Evidence captured and embedded in this report</w:t>
+              <w:t>Embedded in the corresponding figures</w:t>
             </w:r>
           </w:p>
         </w:tc>
@@ -3818,7 +3818,7 @@
           <w:rFonts w:ascii="Times New Roman" w:hAnsi="Times New Roman"/>
           <w:color w:val="000000"/>
         </w:rPr>
-        <w:t>Thus the extrinsic sequence and the reversed intrinsic sequence have exactly the same final orientation. This completes the optional deliverable without requiring an additional ROS screenshot.</w:t>
+        <w:t>Thus the extrinsic sequence and the reversed intrinsic sequence have exactly the same final orientation. This completes the optional deliverable.</w:t>
       </w:r>
     </w:p>
     <w:p>
@@ -3833,7 +3833,7 @@
           <w:rFonts w:ascii="Times New Roman" w:hAnsi="Times New Roman"/>
           <w:color w:val="000000"/>
         </w:rPr>
-        <w:t>9. COMPLETE OPERATION AND SCREENSHOT PROCEDURE</w:t>
+        <w:t>9. CONCLUSION</w:t>
       </w:r>
     </w:p>
     <w:p>
@@ -3847,821 +3847,7 @@
           <w:rFonts w:ascii="Times New Roman" w:hAnsi="Times New Roman"/>
           <w:color w:val="000000"/>
         </w:rPr>
-        <w:t>The following sequence produces the evidence required for the final report. Run each command in a separate Ubuntu terminal unless the command is explicitly marked as a continuation in the same terminal.</w:t>
-      </w:r>
-    </w:p>
-    <w:p>
-      <w:pPr>
-        <w:pStyle w:val="Normal"/>
-        <w:spacing w:before="0" w:after="40" w:line="240" w:lineRule="auto"/>
-        <w:ind w:left="230" w:hanging="158"/>
-      </w:pPr>
-      <w:r>
-        <w:rPr>
-          <w:rFonts w:ascii="Times New Roman" w:hAnsi="Times New Roman"/>
-          <w:color w:val="000000"/>
-        </w:rPr>
-        <w:t>1. Enter Ubuntu from PowerShell with: wsl -d Ubuntu-20.04.</w:t>
-      </w:r>
-    </w:p>
-    <w:p>
-      <w:pPr>
-        <w:pStyle w:val="Normal"/>
-        <w:spacing w:before="0" w:after="40" w:line="240" w:lineRule="auto"/>
-        <w:ind w:left="230" w:hanging="158"/>
-      </w:pPr>
-      <w:r>
-        <w:rPr>
-          <w:rFonts w:ascii="Times New Roman" w:hAnsi="Times New Roman"/>
-          <w:color w:val="000000"/>
-        </w:rPr>
-        <w:t>2. In Terminal 1 run source /opt/ros/noetic/setup.bash and roscore. Capture the terminal only if the instructor requests ROS master evidence.</w:t>
-      </w:r>
-    </w:p>
-    <w:p>
-      <w:pPr>
-        <w:pStyle w:val="Normal"/>
-        <w:spacing w:before="0" w:after="40" w:line="240" w:lineRule="auto"/>
-        <w:ind w:left="230" w:hanging="158"/>
-      </w:pPr>
-      <w:r>
-        <w:rPr>
-          <w:rFonts w:ascii="Times New Roman" w:hAnsi="Times New Roman"/>
-          <w:color w:val="000000"/>
-        </w:rPr>
-        <w:t>3. In Terminal 2 run source /opt/ros/noetic/setup.bash, source /root/vnav_ws/devel/setup.bash, rosversion -d, which roscore, which rviz, and rospack find two_drones_pkg. Capture Fig. 1.</w:t>
-      </w:r>
-    </w:p>
-    <w:p>
-      <w:pPr>
-        <w:pStyle w:val="Normal"/>
-        <w:spacing w:before="0" w:after="40" w:line="240" w:lineRule="auto"/>
-        <w:ind w:left="230" w:hanging="158"/>
-      </w:pPr>
-      <w:r>
-        <w:rPr>
-          <w:rFonts w:ascii="Times New Roman" w:hAnsi="Times New Roman"/>
-          <w:color w:val="000000"/>
-        </w:rPr>
-        <w:t>4. Run roslaunch two_drones_pkg two_drones.launch static:=true. Wait for RViz. Confirm Fixed Frame = world, MarkerArray status OK, and AVs checked. Capture Fig. 2.</w:t>
-      </w:r>
-    </w:p>
-    <w:p>
-      <w:pPr>
-        <w:pStyle w:val="Normal"/>
-        <w:spacing w:before="0" w:after="40" w:line="240" w:lineRule="auto"/>
-        <w:ind w:left="230" w:hanging="158"/>
-      </w:pPr>
-      <w:r>
-        <w:rPr>
-          <w:rFonts w:ascii="Times New Roman" w:hAnsi="Times New Roman"/>
-          <w:color w:val="000000"/>
-        </w:rPr>
-        <w:t>5. In Terminal 3 run rosnode list, rostopic list, rosnode info /plots_publisher_node, and rostopic info /visuals. Capture Fig. 3.</w:t>
-      </w:r>
-    </w:p>
-    <w:p>
-      <w:pPr>
-        <w:pStyle w:val="Normal"/>
-        <w:spacing w:before="0" w:after="40" w:line="240" w:lineRule="auto"/>
-        <w:ind w:left="230" w:hanging="158"/>
-      </w:pPr>
-      <w:r>
-        <w:rPr>
-          <w:rFonts w:ascii="Times New Roman" w:hAnsi="Times New Roman"/>
-          <w:color w:val="000000"/>
-        </w:rPr>
-        <w:t>6. Stop only the launch with Ctrl+C. Keep roscore running.</w:t>
-      </w:r>
-    </w:p>
-    <w:p>
-      <w:pPr>
-        <w:pStyle w:val="Normal"/>
-        <w:spacing w:before="0" w:after="40" w:line="240" w:lineRule="auto"/>
-        <w:ind w:left="230" w:hanging="158"/>
-      </w:pPr>
-      <w:r>
-        <w:rPr>
-          <w:rFonts w:ascii="Times New Roman" w:hAnsi="Times New Roman"/>
-          <w:color w:val="000000"/>
-        </w:rPr>
-        <w:t>7. Run roslaunch two_drones_pkg two_drones.launch. Wait 5 to 10 seconds so the three trails become visible. Capture Fig. 4.</w:t>
-      </w:r>
-    </w:p>
-    <w:p>
-      <w:pPr>
-        <w:pStyle w:val="Normal"/>
-        <w:spacing w:before="0" w:after="40" w:line="240" w:lineRule="auto"/>
-        <w:ind w:left="230" w:hanging="158"/>
-      </w:pPr>
-      <w:r>
-        <w:rPr>
-          <w:rFonts w:ascii="Times New Roman" w:hAnsi="Times New Roman"/>
-          <w:color w:val="000000"/>
-        </w:rPr>
-        <w:t>8. In Terminal 3 run rosrun tf tf_echo world av1 and rostopic hz /tf. Wait until translation values change and the frequency stabilizes. Capture Fig. 5.</w:t>
-      </w:r>
-    </w:p>
-    <w:p>
-      <w:pPr>
-        <w:pStyle w:val="Normal"/>
-        <w:spacing w:before="0" w:after="40" w:line="240" w:lineRule="auto"/>
-        <w:ind w:left="230" w:hanging="158"/>
-      </w:pPr>
-      <w:r>
-        <w:rPr>
-          <w:rFonts w:ascii="Times New Roman" w:hAnsi="Times New Roman"/>
-          <w:color w:val="000000"/>
-        </w:rPr>
-        <w:t>9. In RViz change Global Options -&gt; Fixed Frame from world to av1. Keep MarkerArray and all four namespaces enabled. Run rosrun tf tf_echo av1 av2 in Terminal 3. Capture Fig. 6.</w:t>
-      </w:r>
-    </w:p>
-    <w:p>
-      <w:pPr>
-        <w:pStyle w:val="Normal"/>
-        <w:spacing w:before="0" w:after="40" w:line="240" w:lineRule="auto"/>
-        <w:ind w:left="230" w:hanging="158"/>
-      </w:pPr>
-      <w:r>
-        <w:rPr>
-          <w:rFonts w:ascii="Times New Roman" w:hAnsi="Times New Roman"/>
-          <w:color w:val="000000"/>
-        </w:rPr>
-        <w:t>10. The captured screenshots are embedded in Figs. 1 through 6. Fig. 7 is the analytic relative-trajectory plot generated from the derived expression.</w:t>
-      </w:r>
-    </w:p>
-    <w:p>
-      <w:pPr>
-        <w:pStyle w:val="Normal"/>
-        <w:spacing w:before="0" w:after="40" w:line="240" w:lineRule="auto"/>
-        <w:ind w:left="230" w:hanging="158"/>
-      </w:pPr>
-      <w:r>
-        <w:rPr>
-          <w:rFonts w:ascii="Times New Roman" w:hAnsi="Times New Roman"/>
-          <w:color w:val="000000"/>
-        </w:rPr>
-        <w:t>11. Before submission, confirm that the document title, author name, student ID, figures, and all mathematical deliverables are present.</w:t>
-      </w:r>
-    </w:p>
-    <w:p>
-      <w:pPr>
-        <w:pStyle w:val="TableTitle"/>
-        <w:spacing w:before="60" w:after="20" w:line="240" w:lineRule="auto"/>
-        <w:jc w:val="center"/>
-        <w:keepNext/>
-        <w:keepLines/>
-      </w:pPr>
-      <w:r>
-        <w:rPr>
-          <w:rFonts w:ascii="Times New Roman" w:hAnsi="Times New Roman"/>
-          <w:color w:val="000000"/>
-        </w:rPr>
-        <w:t>TABLE V. FINAL SUBMISSION CHECKLIST</w:t>
-      </w:r>
-    </w:p>
-    <w:tbl>
-      <w:tblPr>
-        <w:tblW w:type="auto" w:w="0"/>
-        <w:tblLayout w:type="autofit"/>
-        <w:tblLook w:firstColumn="1" w:firstRow="1" w:lastColumn="0" w:lastRow="0" w:noHBand="0" w:noVBand="1" w:val="04A0"/>
-        <w:jc w:val="center"/>
-        <w:tblBorders>
-          <w:top w:val="single" w:sz="12" w:color="000000"/>
-          <w:left w:val="nil"/>
-          <w:bottom w:val="single" w:sz="12" w:color="000000"/>
-          <w:right w:val="nil"/>
-          <w:insideH w:val="single" w:sz="6" w:color="666666"/>
-          <w:insideV w:val="nil"/>
-        </w:tblBorders>
-      </w:tblPr>
-      <w:tblGrid>
-        <w:gridCol w:w="5082"/>
-        <w:gridCol w:w="5082"/>
-      </w:tblGrid>
-      <w:tr>
-        <w:trPr>
-          <w:tblHeader/>
-          <w:cantSplit/>
-        </w:trPr>
-        <w:tc>
-          <w:tcPr>
-            <w:tcW w:type="dxa" w:w="2376"/>
-            <w:vAlign w:val="center"/>
-            <w:tcMar>
-              <w:top w:w="90" w:type="dxa"/>
-              <w:start w:w="100" w:type="dxa"/>
-              <w:bottom w:w="90" w:type="dxa"/>
-              <w:end w:w="100" w:type="dxa"/>
-            </w:tcMar>
-            <w:shd w:fill="E7E6E6"/>
-          </w:tcPr>
-          <w:p>
-            <w:pPr>
-              <w:spacing w:before="0" w:after="0" w:line="240" w:lineRule="auto"/>
-              <w:jc w:val="center"/>
-            </w:pPr>
-            <w:r>
-              <w:rPr>
-                <w:rFonts w:ascii="Times New Roman" w:hAnsi="Times New Roman"/>
-                <w:b/>
-                <w:color w:val="000000"/>
-                <w:sz w:val="16"/>
-              </w:rPr>
-            </w:r>
-            <w:r>
-              <w:rPr>
-                <w:rFonts w:ascii="Times New Roman" w:hAnsi="Times New Roman"/>
-                <w:b/>
-                <w:color w:val="000000"/>
-                <w:sz w:val="16"/>
-              </w:rPr>
-              <w:t>Evidence</w:t>
-            </w:r>
-          </w:p>
-        </w:tc>
-        <w:tc>
-          <w:tcPr>
-            <w:tcW w:type="dxa" w:w="2304"/>
-            <w:vAlign w:val="center"/>
-            <w:tcMar>
-              <w:top w:w="90" w:type="dxa"/>
-              <w:start w:w="100" w:type="dxa"/>
-              <w:bottom w:w="90" w:type="dxa"/>
-              <w:end w:w="100" w:type="dxa"/>
-            </w:tcMar>
-            <w:shd w:fill="E7E6E6"/>
-          </w:tcPr>
-          <w:p>
-            <w:pPr>
-              <w:spacing w:before="0" w:after="0" w:line="240" w:lineRule="auto"/>
-              <w:jc w:val="center"/>
-            </w:pPr>
-            <w:r>
-              <w:rPr>
-                <w:rFonts w:ascii="Times New Roman" w:hAnsi="Times New Roman"/>
-                <w:b/>
-                <w:color w:val="000000"/>
-                <w:sz w:val="16"/>
-              </w:rPr>
-            </w:r>
-            <w:r>
-              <w:rPr>
-                <w:rFonts w:ascii="Times New Roman" w:hAnsi="Times New Roman"/>
-                <w:b/>
-                <w:color w:val="000000"/>
-                <w:sz w:val="16"/>
-              </w:rPr>
-              <w:t>Status before student insertion</w:t>
-            </w:r>
-          </w:p>
-        </w:tc>
-      </w:tr>
-      <w:tr>
-        <w:trPr>
-          <w:cantSplit/>
-        </w:trPr>
-        <w:tc>
-          <w:tcPr>
-            <w:tcW w:type="dxa" w:w="2376"/>
-            <w:vAlign w:val="center"/>
-            <w:tcMar>
-              <w:top w:w="90" w:type="dxa"/>
-              <w:start w:w="100" w:type="dxa"/>
-              <w:bottom w:w="90" w:type="dxa"/>
-              <w:end w:w="100" w:type="dxa"/>
-            </w:tcMar>
-          </w:tcPr>
-          <w:p>
-            <w:pPr>
-              <w:spacing w:before="0" w:after="0" w:line="240" w:lineRule="auto"/>
-              <w:jc w:val="center"/>
-            </w:pPr>
-            <w:r>
-              <w:rPr>
-                <w:rFonts w:ascii="Times New Roman" w:hAnsi="Times New Roman"/>
-                <w:color w:val="000000"/>
-                <w:sz w:val="16"/>
-              </w:rPr>
-            </w:r>
-            <w:r>
-              <w:rPr>
-                <w:rFonts w:ascii="Times New Roman" w:hAnsi="Times New Roman"/>
-                <w:b w:val="0"/>
-                <w:color w:val="000000"/>
-                <w:sz w:val="16"/>
-              </w:rPr>
-              <w:t>ROS Noetic and package path</w:t>
-            </w:r>
-          </w:p>
-        </w:tc>
-        <w:tc>
-          <w:tcPr>
-            <w:tcW w:type="dxa" w:w="2304"/>
-            <w:vAlign w:val="center"/>
-            <w:tcMar>
-              <w:top w:w="90" w:type="dxa"/>
-              <w:start w:w="100" w:type="dxa"/>
-              <w:bottom w:w="90" w:type="dxa"/>
-              <w:end w:w="100" w:type="dxa"/>
-            </w:tcMar>
-          </w:tcPr>
-          <w:p>
-            <w:pPr>
-              <w:spacing w:before="0" w:after="0" w:line="240" w:lineRule="auto"/>
-              <w:jc w:val="left"/>
-            </w:pPr>
-            <w:r>
-              <w:rPr>
-                <w:rFonts w:ascii="Times New Roman" w:hAnsi="Times New Roman"/>
-                <w:color w:val="000000"/>
-                <w:sz w:val="16"/>
-              </w:rPr>
-            </w:r>
-            <w:r>
-              <w:rPr>
-                <w:rFonts w:ascii="Times New Roman" w:hAnsi="Times New Roman"/>
-                <w:b w:val="0"/>
-                <w:color w:val="000000"/>
-                <w:sz w:val="16"/>
-              </w:rPr>
-              <w:t>Verified in Fig. 1</w:t>
-            </w:r>
-          </w:p>
-        </w:tc>
-      </w:tr>
-      <w:tr>
-        <w:trPr>
-          <w:cantSplit/>
-        </w:trPr>
-        <w:tc>
-          <w:tcPr>
-            <w:tcW w:type="dxa" w:w="2376"/>
-            <w:vAlign w:val="center"/>
-            <w:tcMar>
-              <w:top w:w="90" w:type="dxa"/>
-              <w:start w:w="100" w:type="dxa"/>
-              <w:bottom w:w="90" w:type="dxa"/>
-              <w:end w:w="100" w:type="dxa"/>
-            </w:tcMar>
-          </w:tcPr>
-          <w:p>
-            <w:pPr>
-              <w:spacing w:before="0" w:after="0" w:line="240" w:lineRule="auto"/>
-              <w:jc w:val="center"/>
-            </w:pPr>
-            <w:r>
-              <w:rPr>
-                <w:rFonts w:ascii="Times New Roman" w:hAnsi="Times New Roman"/>
-                <w:color w:val="000000"/>
-                <w:sz w:val="16"/>
-              </w:rPr>
-            </w:r>
-            <w:r>
-              <w:rPr>
-                <w:rFonts w:ascii="Times New Roman" w:hAnsi="Times New Roman"/>
-                <w:b w:val="0"/>
-                <w:color w:val="000000"/>
-                <w:sz w:val="16"/>
-              </w:rPr>
-              <w:t>Static nodes and topics</w:t>
-            </w:r>
-          </w:p>
-        </w:tc>
-        <w:tc>
-          <w:tcPr>
-            <w:tcW w:type="dxa" w:w="2304"/>
-            <w:vAlign w:val="center"/>
-            <w:tcMar>
-              <w:top w:w="90" w:type="dxa"/>
-              <w:start w:w="100" w:type="dxa"/>
-              <w:bottom w:w="90" w:type="dxa"/>
-              <w:end w:w="100" w:type="dxa"/>
-            </w:tcMar>
-          </w:tcPr>
-          <w:p>
-            <w:pPr>
-              <w:spacing w:before="0" w:after="0" w:line="240" w:lineRule="auto"/>
-              <w:jc w:val="left"/>
-            </w:pPr>
-            <w:r>
-              <w:rPr>
-                <w:rFonts w:ascii="Times New Roman" w:hAnsi="Times New Roman"/>
-                <w:color w:val="000000"/>
-                <w:sz w:val="16"/>
-              </w:rPr>
-            </w:r>
-            <w:r>
-              <w:rPr>
-                <w:rFonts w:ascii="Times New Roman" w:hAnsi="Times New Roman"/>
-                <w:b w:val="0"/>
-                <w:color w:val="000000"/>
-                <w:sz w:val="16"/>
-              </w:rPr>
-              <w:t>Verified in Figs. 2 and 3</w:t>
-            </w:r>
-          </w:p>
-        </w:tc>
-      </w:tr>
-      <w:tr>
-        <w:trPr>
-          <w:cantSplit/>
-        </w:trPr>
-        <w:tc>
-          <w:tcPr>
-            <w:tcW w:type="dxa" w:w="2376"/>
-            <w:vAlign w:val="center"/>
-            <w:tcMar>
-              <w:top w:w="90" w:type="dxa"/>
-              <w:start w:w="100" w:type="dxa"/>
-              <w:bottom w:w="90" w:type="dxa"/>
-              <w:end w:w="100" w:type="dxa"/>
-            </w:tcMar>
-          </w:tcPr>
-          <w:p>
-            <w:pPr>
-              <w:spacing w:before="0" w:after="0" w:line="240" w:lineRule="auto"/>
-              <w:jc w:val="center"/>
-            </w:pPr>
-            <w:r>
-              <w:rPr>
-                <w:rFonts w:ascii="Times New Roman" w:hAnsi="Times New Roman"/>
-                <w:color w:val="000000"/>
-                <w:sz w:val="16"/>
-              </w:rPr>
-            </w:r>
-            <w:r>
-              <w:rPr>
-                <w:rFonts w:ascii="Times New Roman" w:hAnsi="Times New Roman"/>
-                <w:b w:val="0"/>
-                <w:color w:val="000000"/>
-                <w:sz w:val="16"/>
-              </w:rPr>
-              <w:t>Dynamic AV1 and AV2 motion</w:t>
-            </w:r>
-          </w:p>
-        </w:tc>
-        <w:tc>
-          <w:tcPr>
-            <w:tcW w:type="dxa" w:w="2304"/>
-            <w:vAlign w:val="center"/>
-            <w:tcMar>
-              <w:top w:w="90" w:type="dxa"/>
-              <w:start w:w="100" w:type="dxa"/>
-              <w:bottom w:w="90" w:type="dxa"/>
-              <w:end w:w="100" w:type="dxa"/>
-            </w:tcMar>
-          </w:tcPr>
-          <w:p>
-            <w:pPr>
-              <w:spacing w:before="0" w:after="0" w:line="240" w:lineRule="auto"/>
-              <w:jc w:val="left"/>
-            </w:pPr>
-            <w:r>
-              <w:rPr>
-                <w:rFonts w:ascii="Times New Roman" w:hAnsi="Times New Roman"/>
-                <w:color w:val="000000"/>
-                <w:sz w:val="16"/>
-              </w:rPr>
-            </w:r>
-            <w:r>
-              <w:rPr>
-                <w:rFonts w:ascii="Times New Roman" w:hAnsi="Times New Roman"/>
-                <w:b w:val="0"/>
-                <w:color w:val="000000"/>
-                <w:sz w:val="16"/>
-              </w:rPr>
-              <w:t>Verified in Fig. 4</w:t>
-            </w:r>
-          </w:p>
-        </w:tc>
-      </w:tr>
-      <w:tr>
-        <w:trPr>
-          <w:cantSplit/>
-        </w:trPr>
-        <w:tc>
-          <w:tcPr>
-            <w:tcW w:type="dxa" w:w="2376"/>
-            <w:vAlign w:val="center"/>
-            <w:tcMar>
-              <w:top w:w="90" w:type="dxa"/>
-              <w:start w:w="100" w:type="dxa"/>
-              <w:bottom w:w="90" w:type="dxa"/>
-              <w:end w:w="100" w:type="dxa"/>
-            </w:tcMar>
-          </w:tcPr>
-          <w:p>
-            <w:pPr>
-              <w:spacing w:before="0" w:after="0" w:line="240" w:lineRule="auto"/>
-              <w:jc w:val="center"/>
-            </w:pPr>
-            <w:r>
-              <w:rPr>
-                <w:rFonts w:ascii="Times New Roman" w:hAnsi="Times New Roman"/>
-                <w:color w:val="000000"/>
-                <w:sz w:val="16"/>
-              </w:rPr>
-            </w:r>
-            <w:r>
-              <w:rPr>
-                <w:rFonts w:ascii="Times New Roman" w:hAnsi="Times New Roman"/>
-                <w:b w:val="0"/>
-                <w:color w:val="000000"/>
-                <w:sz w:val="16"/>
-              </w:rPr>
-              <w:t>Changing TF values and frequency</w:t>
-            </w:r>
-          </w:p>
-        </w:tc>
-        <w:tc>
-          <w:tcPr>
-            <w:tcW w:type="dxa" w:w="2304"/>
-            <w:vAlign w:val="center"/>
-            <w:tcMar>
-              <w:top w:w="90" w:type="dxa"/>
-              <w:start w:w="100" w:type="dxa"/>
-              <w:bottom w:w="90" w:type="dxa"/>
-              <w:end w:w="100" w:type="dxa"/>
-            </w:tcMar>
-          </w:tcPr>
-          <w:p>
-            <w:pPr>
-              <w:spacing w:before="0" w:after="0" w:line="240" w:lineRule="auto"/>
-              <w:jc w:val="left"/>
-            </w:pPr>
-            <w:r>
-              <w:rPr>
-                <w:rFonts w:ascii="Times New Roman" w:hAnsi="Times New Roman"/>
-                <w:color w:val="000000"/>
-                <w:sz w:val="16"/>
-              </w:rPr>
-            </w:r>
-            <w:r>
-              <w:rPr>
-                <w:rFonts w:ascii="Times New Roman" w:hAnsi="Times New Roman"/>
-                <w:b w:val="0"/>
-                <w:color w:val="000000"/>
-                <w:sz w:val="16"/>
-              </w:rPr>
-              <w:t>Verified in Fig. 5</w:t>
-            </w:r>
-          </w:p>
-        </w:tc>
-      </w:tr>
-      <w:tr>
-        <w:trPr>
-          <w:cantSplit/>
-        </w:trPr>
-        <w:tc>
-          <w:tcPr>
-            <w:tcW w:type="dxa" w:w="2376"/>
-            <w:vAlign w:val="center"/>
-            <w:tcMar>
-              <w:top w:w="90" w:type="dxa"/>
-              <w:start w:w="100" w:type="dxa"/>
-              <w:bottom w:w="90" w:type="dxa"/>
-              <w:end w:w="100" w:type="dxa"/>
-            </w:tcMar>
-          </w:tcPr>
-          <w:p>
-            <w:pPr>
-              <w:spacing w:before="0" w:after="0" w:line="240" w:lineRule="auto"/>
-              <w:jc w:val="center"/>
-            </w:pPr>
-            <w:r>
-              <w:rPr>
-                <w:rFonts w:ascii="Times New Roman" w:hAnsi="Times New Roman"/>
-                <w:color w:val="000000"/>
-                <w:sz w:val="16"/>
-              </w:rPr>
-            </w:r>
-            <w:r>
-              <w:rPr>
-                <w:rFonts w:ascii="Times New Roman" w:hAnsi="Times New Roman"/>
-                <w:b w:val="0"/>
-                <w:color w:val="000000"/>
-                <w:sz w:val="16"/>
-              </w:rPr>
-              <w:t>Relative AV2-to-AV1 view</w:t>
-            </w:r>
-          </w:p>
-        </w:tc>
-        <w:tc>
-          <w:tcPr>
-            <w:tcW w:type="dxa" w:w="2304"/>
-            <w:vAlign w:val="center"/>
-            <w:tcMar>
-              <w:top w:w="90" w:type="dxa"/>
-              <w:start w:w="100" w:type="dxa"/>
-              <w:bottom w:w="90" w:type="dxa"/>
-              <w:end w:w="100" w:type="dxa"/>
-            </w:tcMar>
-          </w:tcPr>
-          <w:p>
-            <w:pPr>
-              <w:spacing w:before="0" w:after="0" w:line="240" w:lineRule="auto"/>
-              <w:jc w:val="left"/>
-            </w:pPr>
-            <w:r>
-              <w:rPr>
-                <w:rFonts w:ascii="Times New Roman" w:hAnsi="Times New Roman"/>
-                <w:color w:val="000000"/>
-                <w:sz w:val="16"/>
-              </w:rPr>
-            </w:r>
-            <w:r>
-              <w:rPr>
-                <w:rFonts w:ascii="Times New Roman" w:hAnsi="Times New Roman"/>
-                <w:b w:val="0"/>
-                <w:color w:val="000000"/>
-                <w:sz w:val="16"/>
-              </w:rPr>
-              <w:t>Verified in Fig. 6</w:t>
-            </w:r>
-          </w:p>
-        </w:tc>
-      </w:tr>
-      <w:tr>
-        <w:trPr>
-          <w:cantSplit/>
-        </w:trPr>
-        <w:tc>
-          <w:tcPr>
-            <w:tcW w:type="dxa" w:w="2376"/>
-            <w:vAlign w:val="center"/>
-            <w:tcMar>
-              <w:top w:w="90" w:type="dxa"/>
-              <w:start w:w="100" w:type="dxa"/>
-              <w:bottom w:w="90" w:type="dxa"/>
-              <w:end w:w="100" w:type="dxa"/>
-            </w:tcMar>
-          </w:tcPr>
-          <w:p>
-            <w:pPr>
-              <w:spacing w:before="0" w:after="0" w:line="240" w:lineRule="auto"/>
-              <w:jc w:val="center"/>
-            </w:pPr>
-            <w:r>
-              <w:rPr>
-                <w:rFonts w:ascii="Times New Roman" w:hAnsi="Times New Roman"/>
-                <w:color w:val="000000"/>
-                <w:sz w:val="16"/>
-              </w:rPr>
-            </w:r>
-            <w:r>
-              <w:rPr>
-                <w:rFonts w:ascii="Times New Roman" w:hAnsi="Times New Roman"/>
-                <w:b w:val="0"/>
-                <w:color w:val="000000"/>
-                <w:sz w:val="16"/>
-              </w:rPr>
-              <w:t>Math derivations</w:t>
-            </w:r>
-          </w:p>
-        </w:tc>
-        <w:tc>
-          <w:tcPr>
-            <w:tcW w:type="dxa" w:w="2304"/>
-            <w:vAlign w:val="center"/>
-            <w:tcMar>
-              <w:top w:w="90" w:type="dxa"/>
-              <w:start w:w="100" w:type="dxa"/>
-              <w:bottom w:w="90" w:type="dxa"/>
-              <w:end w:w="100" w:type="dxa"/>
-            </w:tcMar>
-          </w:tcPr>
-          <w:p>
-            <w:pPr>
-              <w:spacing w:before="0" w:after="0" w:line="240" w:lineRule="auto"/>
-              <w:jc w:val="left"/>
-            </w:pPr>
-            <w:r>
-              <w:rPr>
-                <w:rFonts w:ascii="Times New Roman" w:hAnsi="Times New Roman"/>
-                <w:color w:val="000000"/>
-                <w:sz w:val="16"/>
-              </w:rPr>
-            </w:r>
-            <w:r>
-              <w:rPr>
-                <w:rFonts w:ascii="Times New Roman" w:hAnsi="Times New Roman"/>
-                <w:b w:val="0"/>
-                <w:color w:val="000000"/>
-                <w:sz w:val="16"/>
-              </w:rPr>
-              <w:t>Deliverables 4-6 completed</w:t>
-            </w:r>
-          </w:p>
-        </w:tc>
-      </w:tr>
-      <w:tr>
-        <w:trPr>
-          <w:cantSplit/>
-        </w:trPr>
-        <w:tc>
-          <w:tcPr>
-            <w:tcW w:type="dxa" w:w="2376"/>
-            <w:vAlign w:val="center"/>
-            <w:tcMar>
-              <w:top w:w="90" w:type="dxa"/>
-              <w:start w:w="100" w:type="dxa"/>
-              <w:bottom w:w="90" w:type="dxa"/>
-              <w:end w:w="100" w:type="dxa"/>
-            </w:tcMar>
-          </w:tcPr>
-          <w:p>
-            <w:pPr>
-              <w:spacing w:before="0" w:after="0" w:line="240" w:lineRule="auto"/>
-              <w:jc w:val="center"/>
-            </w:pPr>
-            <w:r>
-              <w:rPr>
-                <w:rFonts w:ascii="Times New Roman" w:hAnsi="Times New Roman"/>
-                <w:color w:val="000000"/>
-                <w:sz w:val="16"/>
-              </w:rPr>
-            </w:r>
-            <w:r>
-              <w:rPr>
-                <w:rFonts w:ascii="Times New Roman" w:hAnsi="Times New Roman"/>
-                <w:b w:val="0"/>
-                <w:color w:val="000000"/>
-                <w:sz w:val="16"/>
-              </w:rPr>
-              <w:t>Author information</w:t>
-            </w:r>
-          </w:p>
-        </w:tc>
-        <w:tc>
-          <w:tcPr>
-            <w:tcW w:type="dxa" w:w="2304"/>
-            <w:vAlign w:val="center"/>
-            <w:tcMar>
-              <w:top w:w="90" w:type="dxa"/>
-              <w:start w:w="100" w:type="dxa"/>
-              <w:bottom w:w="90" w:type="dxa"/>
-              <w:end w:w="100" w:type="dxa"/>
-            </w:tcMar>
-          </w:tcPr>
-          <w:p>
-            <w:pPr>
-              <w:spacing w:before="0" w:after="0" w:line="240" w:lineRule="auto"/>
-              <w:jc w:val="left"/>
-            </w:pPr>
-            <w:r>
-              <w:rPr>
-                <w:rFonts w:ascii="Times New Roman" w:hAnsi="Times New Roman"/>
-                <w:color w:val="000000"/>
-                <w:sz w:val="16"/>
-              </w:rPr>
-            </w:r>
-            <w:r>
-              <w:rPr>
-                <w:rFonts w:ascii="Times New Roman" w:hAnsi="Times New Roman"/>
-                <w:b w:val="0"/>
-                <w:color w:val="000000"/>
-                <w:sz w:val="16"/>
-              </w:rPr>
-              <w:t>Li Zehao; 24020036039</w:t>
-            </w:r>
-          </w:p>
-        </w:tc>
-      </w:tr>
-    </w:tbl>
-    <w:p>
-      <w:pPr>
-        <w:pStyle w:val="Normal"/>
-        <w:spacing w:before="0" w:after="20" w:line="240" w:lineRule="auto"/>
-      </w:pPr>
-    </w:p>
-    <w:p>
-      <w:pPr>
-        <w:pStyle w:val="Heading1"/>
-        <w:spacing w:before="100" w:after="40" w:line="240" w:lineRule="auto"/>
-        <w:keepNext/>
-        <w:keepLines/>
-      </w:pPr>
-      <w:r>
-        <w:rPr>
-          <w:rFonts w:ascii="Times New Roman" w:hAnsi="Times New Roman"/>
-          <w:color w:val="000000"/>
-        </w:rPr>
-        <w:t>10. CONCLUSION</w:t>
-      </w:r>
-    </w:p>
-    <w:p>
-      <w:pPr>
-        <w:pStyle w:val="Normal"/>
-        <w:spacing w:before="0" w:after="60" w:line="240" w:lineRule="auto"/>
-        <w:ind w:firstLine="230"/>
-      </w:pPr>
-      <w:r>
-        <w:rPr>
-          <w:rFonts w:ascii="Times New Roman" w:hAnsi="Times New Roman"/>
-          <w:color w:val="000000"/>
-        </w:rPr>
-        <w:t>LAB2 established a working ROS 1 Noetic environment and used it to publish, query, and visualize the two-drone coordinate frames. The implementation satisfies the required node, topic, launch, transform, and tf2 lookup functions. The analytic results show that the AV2 trajectory is a parabola in the world frame and an ellipse on the plane z - 2y = 1 when expressed relative to AV1. The remaining report work is limited to inserting the student's screenshots and completing the identifying information and any instructor-required explicit matrix expansion.</w:t>
+        <w:t>LAB2 established a working ROS 1 Noetic environment and used it to publish, query, and visualize the two-drone coordinate frames. The implementation satisfies the required node, topic, launch, transform, and tf2 lookup functions. The analytic results show that the AV2 trajectory is a parabola in the world frame and an ellipse on the plane z - 2y = 1 when expressed relative to AV1.</w:t>
       </w:r>
     </w:p>
     <w:p>

</xml_diff>